<commit_message>
changed the formatting and wording of the homepage
</commit_message>
<xml_diff>
--- a/Anis' professional page structure.docx
+++ b/Anis' professional page structure.docx
@@ -1700,12 +1700,75 @@
           <w:lang w:val="en-US"/>
         </w:rPr>
       </w:pPr>
-      <w:r>
-        <w:rPr>
-          <w:lang w:val="en-US"/>
-        </w:rPr>
-        <w:t>https://www.getweave.com/obgyn-marketing/</w:t>
-      </w:r>
+      <w:hyperlink r:id="rId10" w:history="1">
+        <w:r>
+          <w:rPr>
+            <w:rStyle w:val="Hyperlink"/>
+            <w:lang w:val="en-US"/>
+          </w:rPr>
+          <w:t>https://www.getweave.com/obgyn-marketing/</w:t>
+        </w:r>
+      </w:hyperlink>
+    </w:p>
+    <w:p>
+      <w:pPr>
+        <w:pStyle w:val="ListParagraph"/>
+        <w:numPr>
+          <w:ilvl w:val="0"/>
+          <w:numId w:val="4"/>
+        </w:numPr>
+        <w:rPr>
+          <w:lang w:val="en-US"/>
+        </w:rPr>
+      </w:pPr>
+      <w:hyperlink r:id="rId11" w:history="1">
+        <w:r>
+          <w:rPr>
+            <w:rStyle w:val="Hyperlink"/>
+            <w:lang w:val="en-US"/>
+          </w:rPr>
+          <w:t>https://desygner.com/blog/industry/how-to-market-obstetricians-gynecologists-business</w:t>
+        </w:r>
+      </w:hyperlink>
+    </w:p>
+    <w:p>
+      <w:pPr>
+        <w:pStyle w:val="ListParagraph"/>
+        <w:numPr>
+          <w:ilvl w:val="0"/>
+          <w:numId w:val="4"/>
+        </w:numPr>
+        <w:rPr>
+          <w:lang w:val="en-US"/>
+        </w:rPr>
+      </w:pPr>
+      <w:r>
+        <w:rPr>
+          <w:lang w:val="en-US"/>
+        </w:rPr>
+        <w:t xml:space="preserve"> </w:t>
+      </w:r>
+      <w:hyperlink r:id="rId12" w:history="1">
+        <w:r>
+          <w:rPr>
+            <w:rStyle w:val="Hyperlink"/>
+            <w:lang w:val="en-US"/>
+          </w:rPr>
+          <w:t>https://www.cardinaldigitalmarketing.com/healthcare-resources/blog/digital-marketing-strategies-tips-ideas-obgyn/</w:t>
+        </w:r>
+      </w:hyperlink>
+    </w:p>
+    <w:p>
+      <w:pPr>
+        <w:pStyle w:val="ListParagraph"/>
+        <w:numPr>
+          <w:ilvl w:val="0"/>
+          <w:numId w:val="4"/>
+        </w:numPr>
+        <w:rPr>
+          <w:lang w:val="en-US"/>
+        </w:rPr>
+      </w:pPr>
     </w:p>
     <w:p>
       <w:pPr>
@@ -1864,7 +1927,6 @@
         <w:rPr>
           <w:lang w:val="en-US"/>
         </w:rPr>
-        <w:lastRenderedPageBreak/>
         <w:t>Fixes –</w:t>
       </w:r>
     </w:p>

</xml_diff>